<commit_message>
feat: add maternity domain schema and permission override foundation - add database design docs, RTW sheet, Part 4 data requirements, and ERD - remove inventory and inventory transaction tables from the design - add TypeORM domain entities and migrations - switch domain migration to createTable/createForeignKeys style - add user-level permission allow/deny overrides - update permission checking to combine role permissions with user overrides - split DTOs into request and response folders
</commit_message>
<xml_diff>
--- a/src/database/docs/data-requirements-part4.docx
+++ b/src/database/docs/data-requirements-part4.docx
@@ -288,6 +288,48 @@
           </w:tcPr>
           <w:p>
             <w:r>
+              <w:t xml:space="preserve">UserPermission</w:t>
+            </w:r>
+          </w:p>
+        </w:tc>
+        <w:tc>
+          <w:tcPr>
+            <w:tcW w:w="2400" w:type="dxa"/>
+          </w:tcPr>
+          <w:p>
+            <w:r>
+              <w:t xml:space="preserve">Represents a per-user permission override.</w:t>
+            </w:r>
+          </w:p>
+        </w:tc>
+        <w:tc>
+          <w:tcPr>
+            <w:tcW w:w="2400" w:type="dxa"/>
+          </w:tcPr>
+          <w:p>
+            <w:r>
+              <w:t xml:space="preserve">User --&lt; UserPermission; Permission --&lt; UserPermission</w:t>
+            </w:r>
+          </w:p>
+        </w:tc>
+        <w:tc>
+          <w:tcPr>
+            <w:tcW w:w="2400" w:type="dxa"/>
+          </w:tcPr>
+          <w:p>
+            <w:r>
+              <w:t xml:space="preserve">RTW.xlsx Sheet 5</w:t>
+            </w:r>
+          </w:p>
+        </w:tc>
+      </w:tr>
+      <w:tr>
+        <w:tc>
+          <w:tcPr>
+            <w:tcW w:w="2400" w:type="dxa"/>
+          </w:tcPr>
+          <w:p>
+            <w:r>
               <w:t xml:space="preserve">UserProfile</w:t>
             </w:r>
           </w:p>
@@ -434,7 +476,7 @@
           </w:tcPr>
           <w:p>
             <w:r>
-              <w:t xml:space="preserve">Facility --&lt; Room; Facility &gt;--&lt; Doctor; Facility &gt;--&lt; StaffProfile; Facility --&lt; FacilityService; Facility --&lt; Appointment; Facility --&lt; Inventory</w:t>
+              <w:t xml:space="preserve">Facility --&lt; Room; Facility &gt;--&lt; Doctor; Facility &gt;--&lt; StaffProfile; Facility --&lt; FacilityService; Facility --&lt; Appointment</w:t>
             </w:r>
           </w:p>
         </w:tc>
@@ -1400,7 +1442,7 @@
           </w:tcPr>
           <w:p>
             <w:r>
-              <w:t xml:space="preserve">ProductCategory --&lt; Product; Product --&lt; CartItem; Product --&lt; Inventory</w:t>
+              <w:t xml:space="preserve">ProductCategory --&lt; Product; Product --&lt; CartItem</w:t>
             </w:r>
           </w:p>
         </w:tc>
@@ -1527,90 +1569,6 @@
           <w:p>
             <w:r>
               <w:t xml:space="preserve">Order -- ProductOrder</w:t>
-            </w:r>
-          </w:p>
-        </w:tc>
-        <w:tc>
-          <w:tcPr>
-            <w:tcW w:w="2400" w:type="dxa"/>
-          </w:tcPr>
-          <w:p>
-            <w:r>
-              <w:t xml:space="preserve">RTW.xlsx Sheet 5</w:t>
-            </w:r>
-          </w:p>
-        </w:tc>
-      </w:tr>
-      <w:tr>
-        <w:tc>
-          <w:tcPr>
-            <w:tcW w:w="2400" w:type="dxa"/>
-          </w:tcPr>
-          <w:p>
-            <w:r>
-              <w:t xml:space="preserve">Inventory</w:t>
-            </w:r>
-          </w:p>
-        </w:tc>
-        <w:tc>
-          <w:tcPr>
-            <w:tcW w:w="2400" w:type="dxa"/>
-          </w:tcPr>
-          <w:p>
-            <w:r>
-              <w:t xml:space="preserve">Represents product stock at a facility.</w:t>
-            </w:r>
-          </w:p>
-        </w:tc>
-        <w:tc>
-          <w:tcPr>
-            <w:tcW w:w="2400" w:type="dxa"/>
-          </w:tcPr>
-          <w:p>
-            <w:r>
-              <w:t xml:space="preserve">Facility --&lt; Inventory; Product --&lt; Inventory; Inventory --&lt; InventoryTransaction</w:t>
-            </w:r>
-          </w:p>
-        </w:tc>
-        <w:tc>
-          <w:tcPr>
-            <w:tcW w:w="2400" w:type="dxa"/>
-          </w:tcPr>
-          <w:p>
-            <w:r>
-              <w:t xml:space="preserve">RTW.xlsx Sheet 5</w:t>
-            </w:r>
-          </w:p>
-        </w:tc>
-      </w:tr>
-      <w:tr>
-        <w:tc>
-          <w:tcPr>
-            <w:tcW w:w="2400" w:type="dxa"/>
-          </w:tcPr>
-          <w:p>
-            <w:r>
-              <w:t xml:space="preserve">InventoryTransaction</w:t>
-            </w:r>
-          </w:p>
-        </w:tc>
-        <w:tc>
-          <w:tcPr>
-            <w:tcW w:w="2400" w:type="dxa"/>
-          </w:tcPr>
-          <w:p>
-            <w:r>
-              <w:t xml:space="preserve">Represents an auditable inventory movement.</w:t>
-            </w:r>
-          </w:p>
-        </w:tc>
-        <w:tc>
-          <w:tcPr>
-            <w:tcW w:w="2400" w:type="dxa"/>
-          </w:tcPr>
-          <w:p>
-            <w:r>
-              <w:t xml:space="preserve">Inventory --&lt; InventoryTransaction; User --&lt; InventoryTransaction</w:t>
             </w:r>
           </w:p>
         </w:tc>
@@ -2400,6 +2358,48 @@
           </w:tcPr>
           <w:p>
             <w:r>
+              <w:t xml:space="preserve">A user permission override must reference an existing user and permission, and only one override may exist for a user-permission pair.</w:t>
+            </w:r>
+          </w:p>
+        </w:tc>
+        <w:tc>
+          <w:tcPr>
+            <w:tcW w:w="2400" w:type="dxa"/>
+          </w:tcPr>
+          <w:p>
+            <w:r>
+              <w:t xml:space="preserve">UserPermission, User, Permission</w:t>
+            </w:r>
+          </w:p>
+        </w:tc>
+        <w:tc>
+          <w:tcPr>
+            <w:tcW w:w="2400" w:type="dxa"/>
+          </w:tcPr>
+          <w:p>
+            <w:r>
+              <w:t xml:space="preserve">Reject invalid override with HTTP 404 or duplicate override with HTTP 409.</w:t>
+            </w:r>
+          </w:p>
+        </w:tc>
+      </w:tr>
+      <w:tr>
+        <w:tc>
+          <w:tcPr>
+            <w:tcW w:w="2400" w:type="dxa"/>
+          </w:tcPr>
+          <w:p>
+            <w:r>
+              <w:t xml:space="preserve">DC-04</w:t>
+            </w:r>
+          </w:p>
+        </w:tc>
+        <w:tc>
+          <w:tcPr>
+            <w:tcW w:w="2400" w:type="dxa"/>
+          </w:tcPr>
+          <w:p>
+            <w:r>
               <w:t xml:space="preserve">Doctor and staff profiles must reference an existing user and must be unique per user.</w:t>
             </w:r>
           </w:p>
@@ -2432,7 +2432,7 @@
           </w:tcPr>
           <w:p>
             <w:r>
-              <w:t xml:space="preserve">DC-04</w:t>
+              <w:t xml:space="preserve">DC-05</w:t>
             </w:r>
           </w:p>
         </w:tc>
@@ -2474,7 +2474,7 @@
           </w:tcPr>
           <w:p>
             <w:r>
-              <w:t xml:space="preserve">DC-05</w:t>
+              <w:t xml:space="preserve">DC-06</w:t>
             </w:r>
           </w:p>
         </w:tc>
@@ -2516,7 +2516,7 @@
           </w:tcPr>
           <w:p>
             <w:r>
-              <w:t xml:space="preserve">DC-06</w:t>
+              <w:t xml:space="preserve">DC-07</w:t>
             </w:r>
           </w:p>
         </w:tc>
@@ -2558,7 +2558,7 @@
           </w:tcPr>
           <w:p>
             <w:r>
-              <w:t xml:space="preserve">DC-07</w:t>
+              <w:t xml:space="preserve">DC-08</w:t>
             </w:r>
           </w:p>
         </w:tc>
@@ -2620,7 +2620,7 @@
           </w:tcPr>
           <w:p>
             <w:r>
-              <w:t xml:space="preserve">DC-08</w:t>
+              <w:t xml:space="preserve">DC-09</w:t>
             </w:r>
           </w:p>
         </w:tc>
@@ -2662,7 +2662,7 @@
           </w:tcPr>
           <w:p>
             <w:r>
-              <w:t xml:space="preserve">DC-09</w:t>
+              <w:t xml:space="preserve">DC-10</w:t>
             </w:r>
           </w:p>
         </w:tc>
@@ -2704,7 +2704,7 @@
           </w:tcPr>
           <w:p>
             <w:r>
-              <w:t xml:space="preserve">DC-10</w:t>
+              <w:t xml:space="preserve">DC-11</w:t>
             </w:r>
           </w:p>
         </w:tc>
@@ -2746,7 +2746,7 @@
           </w:tcPr>
           <w:p>
             <w:r>
-              <w:t xml:space="preserve">DC-11</w:t>
+              <w:t xml:space="preserve">DC-12</w:t>
             </w:r>
           </w:p>
         </w:tc>
@@ -2788,7 +2788,7 @@
           </w:tcPr>
           <w:p>
             <w:r>
-              <w:t xml:space="preserve">DC-12</w:t>
+              <w:t xml:space="preserve">DC-13</w:t>
             </w:r>
           </w:p>
         </w:tc>
@@ -2830,7 +2830,7 @@
           </w:tcPr>
           <w:p>
             <w:r>
-              <w:t xml:space="preserve">DC-13</w:t>
+              <w:t xml:space="preserve">DC-14</w:t>
             </w:r>
           </w:p>
         </w:tc>
@@ -2872,7 +2872,7 @@
           </w:tcPr>
           <w:p>
             <w:r>
-              <w:t xml:space="preserve">DC-14</w:t>
+              <w:t xml:space="preserve">DC-15</w:t>
             </w:r>
           </w:p>
         </w:tc>
@@ -2914,7 +2914,7 @@
           </w:tcPr>
           <w:p>
             <w:r>
-              <w:t xml:space="preserve">DC-15</w:t>
+              <w:t xml:space="preserve">DC-16</w:t>
             </w:r>
           </w:p>
         </w:tc>
@@ -2956,7 +2956,7 @@
           </w:tcPr>
           <w:p>
             <w:r>
-              <w:t xml:space="preserve">DC-16</w:t>
+              <w:t xml:space="preserve">DC-17</w:t>
             </w:r>
           </w:p>
         </w:tc>
@@ -2998,48 +2998,6 @@
           </w:tcPr>
           <w:p>
             <w:r>
-              <w:t xml:space="preserve">DC-17</w:t>
-            </w:r>
-          </w:p>
-        </w:tc>
-        <w:tc>
-          <w:tcPr>
-            <w:tcW w:w="2400" w:type="dxa"/>
-          </w:tcPr>
-          <w:p>
-            <w:r>
-              <w:t xml:space="preserve">Inventory reserved quantity cannot exceed quantity on hand.</w:t>
-            </w:r>
-          </w:p>
-        </w:tc>
-        <w:tc>
-          <w:tcPr>
-            <w:tcW w:w="2400" w:type="dxa"/>
-          </w:tcPr>
-          <w:p>
-            <w:r>
-              <w:t xml:space="preserve">Inventory, InventoryTransaction</w:t>
-            </w:r>
-          </w:p>
-        </w:tc>
-        <w:tc>
-          <w:tcPr>
-            <w:tcW w:w="2400" w:type="dxa"/>
-          </w:tcPr>
-          <w:p>
-            <w:r>
-              <w:t xml:space="preserve">Reject reserve/export operation with HTTP 422.</w:t>
-            </w:r>
-          </w:p>
-        </w:tc>
-      </w:tr>
-      <w:tr>
-        <w:tc>
-          <w:tcPr>
-            <w:tcW w:w="2400" w:type="dxa"/>
-          </w:tcPr>
-          <w:p>
-            <w:r>
               <w:t xml:space="preserve">DC-18</w:t>
             </w:r>
           </w:p>
@@ -3312,7 +3270,7 @@
           </w:tcPr>
           <w:p>
             <w:r>
-              <w:t xml:space="preserve">AppointmentStatusLog, PrescriptionHistory, InventoryTransaction, PregnancyHistoryEvent</w:t>
+              <w:t xml:space="preserve">AppointmentStatusLog, PrescriptionHistory, PregnancyHistoryEvent</w:t>
             </w:r>
           </w:p>
         </w:tc>
@@ -3539,6 +3497,58 @@
           </w:tcPr>
           <w:p>
             <w:r>
+              <w:t xml:space="preserve">User permission overrides</w:t>
+            </w:r>
+          </w:p>
+        </w:tc>
+        <w:tc>
+          <w:tcPr>
+            <w:tcW w:w="2400" w:type="dxa"/>
+          </w:tcPr>
+          <w:p>
+            <w:r>
+              <w:t xml:space="preserve">Until override is removed or user account is deleted</w:t>
+            </w:r>
+          </w:p>
+        </w:tc>
+        <w:tc>
+          <w:tcPr>
+            <w:tcW w:w="2400" w:type="dxa"/>
+          </w:tcPr>
+          <w:p>
+            <w:r>
+              <w:t xml:space="preserve">System</w:t>
+            </w:r>
+          </w:p>
+        </w:tc>
+        <w:tc>
+          <w:tcPr>
+            <w:tcW w:w="2400" w:type="dxa"/>
+          </w:tcPr>
+          <w:p>
+            <w:r>
+              <w:t xml:space="preserve">System admin or authorized account manager</w:t>
+            </w:r>
+          </w:p>
+        </w:tc>
+        <w:tc>
+          <w:tcPr>
+            <w:tcW w:w="2400" w:type="dxa"/>
+          </w:tcPr>
+          <w:p>
+            <w:r>
+              <w:t xml:space="preserve">Access control exception policy</w:t>
+            </w:r>
+          </w:p>
+        </w:tc>
+      </w:tr>
+      <w:tr>
+        <w:tc>
+          <w:tcPr>
+            <w:tcW w:w="2400" w:type="dxa"/>
+          </w:tcPr>
+          <w:p>
+            <w:r>
               <w:t xml:space="preserve">Facility, room, staff assignment data</w:t>
             </w:r>
           </w:p>
@@ -3944,58 +3954,6 @@
           <w:p>
             <w:r>
               <w:t xml:space="preserve">User convenience and storage policy</w:t>
-            </w:r>
-          </w:p>
-        </w:tc>
-      </w:tr>
-      <w:tr>
-        <w:tc>
-          <w:tcPr>
-            <w:tcW w:w="2400" w:type="dxa"/>
-          </w:tcPr>
-          <w:p>
-            <w:r>
-              <w:t xml:space="preserve">Inventory and inventory transactions</w:t>
-            </w:r>
-          </w:p>
-        </w:tc>
-        <w:tc>
-          <w:tcPr>
-            <w:tcW w:w="2400" w:type="dxa"/>
-          </w:tcPr>
-          <w:p>
-            <w:r>
-              <w:t xml:space="preserve">Inventory records retained while product/facility active; transactions retained for audit period</w:t>
-            </w:r>
-          </w:p>
-        </w:tc>
-        <w:tc>
-          <w:tcPr>
-            <w:tcW w:w="2400" w:type="dxa"/>
-          </w:tcPr>
-          <w:p>
-            <w:r>
-              <w:t xml:space="preserve">Shop / System</w:t>
-            </w:r>
-          </w:p>
-        </w:tc>
-        <w:tc>
-          <w:tcPr>
-            <w:tcW w:w="2400" w:type="dxa"/>
-          </w:tcPr>
-          <w:p>
-            <w:r>
-              <w:t xml:space="preserve">Inventory manager can adjust through transaction; transaction deletion prohibited</w:t>
-            </w:r>
-          </w:p>
-        </w:tc>
-        <w:tc>
-          <w:tcPr>
-            <w:tcW w:w="2400" w:type="dxa"/>
-          </w:tcPr>
-          <w:p>
-            <w:r>
-              <w:t xml:space="preserve">Stock audit policy</w:t>
             </w:r>
           </w:p>
         </w:tc>
@@ -10722,7 +10680,7 @@
           </w:tcPr>
           <w:p>
             <w:r>
-              <w:t xml:space="preserve">Product order is paid and stock can be reserved</w:t>
+              <w:t xml:space="preserve">Product order is paid and shipping information is valid</w:t>
             </w:r>
           </w:p>
         </w:tc>
@@ -10742,7 +10700,7 @@
           </w:tcPr>
           <w:p>
             <w:r>
-              <w:t xml:space="preserve">Reserve inventory and notify warehouse/staff.</w:t>
+              <w:t xml:space="preserve">Notify warehouse/staff to prepare shipment.</w:t>
             </w:r>
           </w:p>
         </w:tc>
@@ -10898,7 +10856,7 @@
           </w:tcPr>
           <w:p>
             <w:r>
-              <w:t xml:space="preserve">Release inventory reservation and trigger refund if paid.</w:t>
+              <w:t xml:space="preserve">Cancel shipment preparation and trigger refund if paid.</w:t>
             </w:r>
           </w:p>
         </w:tc>
@@ -10950,7 +10908,7 @@
           </w:tcPr>
           <w:p>
             <w:r>
-              <w:t xml:space="preserve">Release inventory reservation and trigger refund if paid.</w:t>
+              <w:t xml:space="preserve">Cancel shipment preparation and trigger refund if paid.</w:t>
             </w:r>
           </w:p>
         </w:tc>
@@ -10958,7 +10916,7 @@
     </w:tbl>
     <w:p>
       <w:r>
-        <w:t xml:space="preserve">Invalid Transitions (must be rejected - DC-17):</w:t>
+        <w:t xml:space="preserve">Invalid Transitions (must be rejected):</w:t>
       </w:r>
     </w:p>
     <w:tbl>
@@ -11413,19 +11371,7 @@
         </w:numPr>
       </w:pPr>
       <w:r>
-        <w:t xml:space="preserve">Inventory reservation race conditions when multiple product orders target the same stock.</w:t>
-      </w:r>
-    </w:p>
-    <w:p>
-      <w:pPr>
-        <w:pStyle w:val="ListParagraph"/>
-        <w:numPr>
-          <w:ilvl w:val="0"/>
-          <w:numId w:val="1"/>
-        </w:numPr>
-      </w:pPr>
-      <w:r>
-        <w:t xml:space="preserve">Audit immutability for status logs, inventory transactions, prescription histories, and pregnancy timeline events.</w:t>
+        <w:t xml:space="preserve">Audit immutability for status logs, prescription histories, and pregnancy timeline events.</w:t>
       </w:r>
     </w:p>
     <w:p>

</xml_diff>